<commit_message>
Knowledge - 3-Work knowledge - 12/18/2025
</commit_message>
<xml_diff>
--- a/Knowledge/3-Work knowledge/1-Software Engineering/2-Web Full Stack/1-World Wide Web/5-My Source/3-Network Topologies/2-Types of Network Topologies.docx
+++ b/Knowledge/3-Work knowledge/1-Software Engineering/2-Web Full Stack/1-World Wide Web/5-My Source/3-Network Topologies/2-Types of Network Topologies.docx
@@ -42,21 +42,12 @@
         </w:rPr>
         <w:t xml:space="preserve">: </w:t>
       </w:r>
-      <w:proofErr w:type="spellStart"/>
       <w:r>
         <w:rPr>
           <w:b/>
           <w:highlight w:val="darkGray"/>
         </w:rPr>
-        <w:t>Chatgpt</w:t>
-      </w:r>
-      <w:proofErr w:type="spellEnd"/>
-      <w:r>
-        <w:rPr>
-          <w:b/>
-          <w:highlight w:val="darkGray"/>
-        </w:rPr>
-        <w:t xml:space="preserve"> (GPT‑5 Mini) at [12/18/2025]</w:t>
+        <w:t>Chatgpt (GPT‑5 Mini) at [12/18/2025]</w:t>
       </w:r>
     </w:p>
     <w:p>
@@ -65,7 +56,7 @@
           <w:noProof/>
         </w:rPr>
         <w:drawing>
-          <wp:inline distT="114300" distB="114300" distL="114300" distR="114300" wp14:anchorId="7132EF0E" wp14:editId="4A09E073">
+          <wp:inline distT="114300" distB="114300" distL="114300" distR="114300" wp14:anchorId="6F3D5606" wp14:editId="1F1A158C">
             <wp:extent cx="5943600" cy="3390900"/>
             <wp:effectExtent l="0" t="0" r="0" b="0"/>
             <wp:docPr id="1" name="image1.png"/>
@@ -104,9 +95,7 @@
     <w:p/>
     <w:tbl>
       <w:tblPr>
-        <w:tblStyle w:val="a"/>
         <w:tblW w:w="9360" w:type="dxa"/>
-        <w:tblInd w:w="0" w:type="dxa"/>
         <w:tblBorders>
           <w:top w:val="nil"/>
           <w:left w:val="nil"/>
@@ -496,32 +485,14 @@
                 <w:bCs/>
                 <w:sz w:val="24"/>
               </w:rPr>
-              <w:t xml:space="preserve">closed </w:t>
-            </w:r>
-            <w:proofErr w:type="gramStart"/>
-            <w:r>
-              <w:rPr>
-                <w:rFonts w:ascii="Roboto Mono" w:eastAsia="Roboto Mono" w:hAnsi="Roboto Mono"/>
-                <w:b/>
-                <w:bCs/>
-                <w:sz w:val="24"/>
-              </w:rPr>
-              <w:t>loop</w:t>
-            </w:r>
-            <w:r>
-              <w:rPr>
-                <w:rFonts w:ascii="Roboto Mono" w:eastAsia="Roboto Mono" w:hAnsi="Roboto Mono"/>
-                <w:sz w:val="24"/>
-              </w:rPr>
-              <w:t>,</w:t>
-            </w:r>
-            <w:proofErr w:type="gramEnd"/>
-            <w:r>
-              <w:rPr>
-                <w:rFonts w:ascii="Roboto Mono" w:eastAsia="Roboto Mono" w:hAnsi="Roboto Mono"/>
-                <w:sz w:val="24"/>
-              </w:rPr>
-              <w:t xml:space="preserve"> each connected to two others</w:t>
+              <w:t>closed loop</w:t>
+            </w:r>
+            <w:r>
+              <w:rPr>
+                <w:rFonts w:ascii="Roboto Mono" w:eastAsia="Roboto Mono" w:hAnsi="Roboto Mono"/>
+                <w:sz w:val="24"/>
+              </w:rPr>
+              <w:t>, each connected to two others</w:t>
             </w:r>
           </w:p>
         </w:tc>
@@ -845,6 +816,7 @@
       </w:tr>
     </w:tbl>
     <w:p/>
+    <w:p/>
     <w:sectPr>
       <w:pgSz w:w="12240" w:h="15840"/>
       <w:pgMar w:top="1440" w:right="1440" w:bottom="1440" w:left="1440" w:header="720" w:footer="720" w:gutter="0"/>
@@ -860,15 +832,17 @@
   <w:docDefaults>
     <w:rPrDefault>
       <w:rPr>
-        <w:rFonts w:ascii="Arial" w:eastAsia="Arial" w:hAnsi="Arial" w:cs="Arial"/>
-        <w:sz w:val="22"/>
-        <w:szCs w:val="22"/>
-        <w:lang w:val="en" w:eastAsia="en-US" w:bidi="ar-SA"/>
+        <w:rFonts w:asciiTheme="minorHAnsi" w:eastAsiaTheme="minorHAnsi" w:hAnsiTheme="minorHAnsi" w:cstheme="minorBidi"/>
+        <w:kern w:val="2"/>
+        <w:sz w:val="24"/>
+        <w:szCs w:val="24"/>
+        <w:lang w:val="en-US" w:eastAsia="en-US" w:bidi="ar-SA"/>
+        <w14:ligatures w14:val="standardContextual"/>
       </w:rPr>
     </w:rPrDefault>
     <w:pPrDefault>
       <w:pPr>
-        <w:spacing w:line="276" w:lineRule="auto"/>
+        <w:spacing w:after="160" w:line="278" w:lineRule="auto"/>
       </w:pPr>
     </w:pPrDefault>
   </w:docDefaults>
@@ -1253,118 +1227,255 @@
   <w:style w:type="paragraph" w:default="1" w:styleId="Normal">
     <w:name w:val="Normal"/>
     <w:qFormat/>
+    <w:rsid w:val="00E85393"/>
+    <w:pPr>
+      <w:spacing w:after="0" w:line="276" w:lineRule="auto"/>
+    </w:pPr>
+    <w:rPr>
+      <w:rFonts w:ascii="Arial" w:eastAsia="Arial" w:hAnsi="Arial" w:cs="Arial"/>
+      <w:kern w:val="0"/>
+      <w:sz w:val="22"/>
+      <w:szCs w:val="22"/>
+      <w:lang w:val="en"/>
+      <w14:ligatures w14:val="none"/>
+    </w:rPr>
   </w:style>
   <w:style w:type="paragraph" w:styleId="Heading1">
     <w:name w:val="heading 1"/>
     <w:basedOn w:val="Normal"/>
     <w:next w:val="Normal"/>
+    <w:link w:val="Heading1Char"/>
     <w:uiPriority w:val="9"/>
     <w:qFormat/>
+    <w:rsid w:val="00CB055B"/>
     <w:pPr>
       <w:keepNext/>
       <w:keepLines/>
-      <w:spacing w:before="400" w:after="120"/>
+      <w:spacing w:before="360" w:after="80" w:line="278" w:lineRule="auto"/>
       <w:outlineLvl w:val="0"/>
     </w:pPr>
     <w:rPr>
+      <w:rFonts w:asciiTheme="majorHAnsi" w:eastAsiaTheme="majorEastAsia" w:hAnsiTheme="majorHAnsi" w:cstheme="majorBidi"/>
+      <w:color w:val="2F5496" w:themeColor="accent1" w:themeShade="BF"/>
+      <w:kern w:val="2"/>
       <w:sz w:val="40"/>
       <w:szCs w:val="40"/>
+      <w:lang w:val="en-US"/>
+      <w14:ligatures w14:val="standardContextual"/>
     </w:rPr>
   </w:style>
   <w:style w:type="paragraph" w:styleId="Heading2">
     <w:name w:val="heading 2"/>
     <w:basedOn w:val="Normal"/>
     <w:next w:val="Normal"/>
+    <w:link w:val="Heading2Char"/>
     <w:uiPriority w:val="9"/>
+    <w:semiHidden/>
     <w:unhideWhenUsed/>
     <w:qFormat/>
+    <w:rsid w:val="00CB055B"/>
     <w:pPr>
       <w:keepNext/>
       <w:keepLines/>
-      <w:spacing w:before="360" w:after="120"/>
+      <w:spacing w:before="160" w:after="80" w:line="278" w:lineRule="auto"/>
       <w:outlineLvl w:val="1"/>
     </w:pPr>
     <w:rPr>
+      <w:rFonts w:asciiTheme="majorHAnsi" w:eastAsiaTheme="majorEastAsia" w:hAnsiTheme="majorHAnsi" w:cstheme="majorBidi"/>
+      <w:color w:val="2F5496" w:themeColor="accent1" w:themeShade="BF"/>
+      <w:kern w:val="2"/>
       <w:sz w:val="32"/>
       <w:szCs w:val="32"/>
+      <w:lang w:val="en-US"/>
+      <w14:ligatures w14:val="standardContextual"/>
     </w:rPr>
   </w:style>
   <w:style w:type="paragraph" w:styleId="Heading3">
     <w:name w:val="heading 3"/>
     <w:basedOn w:val="Normal"/>
     <w:next w:val="Normal"/>
+    <w:link w:val="Heading3Char"/>
     <w:uiPriority w:val="9"/>
     <w:semiHidden/>
     <w:unhideWhenUsed/>
     <w:qFormat/>
+    <w:rsid w:val="00CB055B"/>
     <w:pPr>
       <w:keepNext/>
       <w:keepLines/>
-      <w:spacing w:before="320" w:after="80"/>
+      <w:spacing w:before="160" w:after="80" w:line="278" w:lineRule="auto"/>
       <w:outlineLvl w:val="2"/>
     </w:pPr>
     <w:rPr>
-      <w:color w:val="434343"/>
+      <w:rFonts w:asciiTheme="minorHAnsi" w:eastAsiaTheme="majorEastAsia" w:hAnsiTheme="minorHAnsi" w:cstheme="majorBidi"/>
+      <w:color w:val="2F5496" w:themeColor="accent1" w:themeShade="BF"/>
+      <w:kern w:val="2"/>
       <w:sz w:val="28"/>
       <w:szCs w:val="28"/>
+      <w:lang w:val="en-US"/>
+      <w14:ligatures w14:val="standardContextual"/>
     </w:rPr>
   </w:style>
   <w:style w:type="paragraph" w:styleId="Heading4">
     <w:name w:val="heading 4"/>
     <w:basedOn w:val="Normal"/>
     <w:next w:val="Normal"/>
+    <w:link w:val="Heading4Char"/>
     <w:uiPriority w:val="9"/>
     <w:semiHidden/>
     <w:unhideWhenUsed/>
     <w:qFormat/>
+    <w:rsid w:val="00CB055B"/>
     <w:pPr>
       <w:keepNext/>
       <w:keepLines/>
-      <w:spacing w:before="280" w:after="80"/>
+      <w:spacing w:before="80" w:after="40" w:line="278" w:lineRule="auto"/>
       <w:outlineLvl w:val="3"/>
     </w:pPr>
     <w:rPr>
-      <w:color w:val="666666"/>
+      <w:rFonts w:asciiTheme="minorHAnsi" w:eastAsiaTheme="majorEastAsia" w:hAnsiTheme="minorHAnsi" w:cstheme="majorBidi"/>
+      <w:i/>
+      <w:iCs/>
+      <w:color w:val="2F5496" w:themeColor="accent1" w:themeShade="BF"/>
+      <w:kern w:val="2"/>
       <w:sz w:val="24"/>
       <w:szCs w:val="24"/>
+      <w:lang w:val="en-US"/>
+      <w14:ligatures w14:val="standardContextual"/>
     </w:rPr>
   </w:style>
   <w:style w:type="paragraph" w:styleId="Heading5">
     <w:name w:val="heading 5"/>
     <w:basedOn w:val="Normal"/>
     <w:next w:val="Normal"/>
+    <w:link w:val="Heading5Char"/>
     <w:uiPriority w:val="9"/>
     <w:semiHidden/>
     <w:unhideWhenUsed/>
     <w:qFormat/>
+    <w:rsid w:val="00CB055B"/>
     <w:pPr>
       <w:keepNext/>
       <w:keepLines/>
-      <w:spacing w:before="240" w:after="80"/>
+      <w:spacing w:before="80" w:after="40" w:line="278" w:lineRule="auto"/>
       <w:outlineLvl w:val="4"/>
     </w:pPr>
     <w:rPr>
-      <w:color w:val="666666"/>
+      <w:rFonts w:asciiTheme="minorHAnsi" w:eastAsiaTheme="majorEastAsia" w:hAnsiTheme="minorHAnsi" w:cstheme="majorBidi"/>
+      <w:color w:val="2F5496" w:themeColor="accent1" w:themeShade="BF"/>
+      <w:kern w:val="2"/>
+      <w:sz w:val="24"/>
+      <w:szCs w:val="24"/>
+      <w:lang w:val="en-US"/>
+      <w14:ligatures w14:val="standardContextual"/>
     </w:rPr>
   </w:style>
   <w:style w:type="paragraph" w:styleId="Heading6">
     <w:name w:val="heading 6"/>
     <w:basedOn w:val="Normal"/>
     <w:next w:val="Normal"/>
+    <w:link w:val="Heading6Char"/>
     <w:uiPriority w:val="9"/>
     <w:semiHidden/>
     <w:unhideWhenUsed/>
     <w:qFormat/>
+    <w:rsid w:val="00CB055B"/>
     <w:pPr>
       <w:keepNext/>
       <w:keepLines/>
-      <w:spacing w:before="240" w:after="80"/>
+      <w:spacing w:before="40" w:line="278" w:lineRule="auto"/>
       <w:outlineLvl w:val="5"/>
     </w:pPr>
     <w:rPr>
+      <w:rFonts w:asciiTheme="minorHAnsi" w:eastAsiaTheme="majorEastAsia" w:hAnsiTheme="minorHAnsi" w:cstheme="majorBidi"/>
       <w:i/>
       <w:iCs/>
-      <w:color w:val="666666"/>
+      <w:color w:val="595959" w:themeColor="text1" w:themeTint="A6"/>
+      <w:kern w:val="2"/>
+      <w:sz w:val="24"/>
+      <w:szCs w:val="24"/>
+      <w:lang w:val="en-US"/>
+      <w14:ligatures w14:val="standardContextual"/>
+    </w:rPr>
+  </w:style>
+  <w:style w:type="paragraph" w:styleId="Heading7">
+    <w:name w:val="heading 7"/>
+    <w:basedOn w:val="Normal"/>
+    <w:next w:val="Normal"/>
+    <w:link w:val="Heading7Char"/>
+    <w:uiPriority w:val="9"/>
+    <w:semiHidden/>
+    <w:unhideWhenUsed/>
+    <w:qFormat/>
+    <w:rsid w:val="00CB055B"/>
+    <w:pPr>
+      <w:keepNext/>
+      <w:keepLines/>
+      <w:spacing w:before="40" w:line="278" w:lineRule="auto"/>
+      <w:outlineLvl w:val="6"/>
+    </w:pPr>
+    <w:rPr>
+      <w:rFonts w:asciiTheme="minorHAnsi" w:eastAsiaTheme="majorEastAsia" w:hAnsiTheme="minorHAnsi" w:cstheme="majorBidi"/>
+      <w:color w:val="595959" w:themeColor="text1" w:themeTint="A6"/>
+      <w:kern w:val="2"/>
+      <w:sz w:val="24"/>
+      <w:szCs w:val="24"/>
+      <w:lang w:val="en-US"/>
+      <w14:ligatures w14:val="standardContextual"/>
+    </w:rPr>
+  </w:style>
+  <w:style w:type="paragraph" w:styleId="Heading8">
+    <w:name w:val="heading 8"/>
+    <w:basedOn w:val="Normal"/>
+    <w:next w:val="Normal"/>
+    <w:link w:val="Heading8Char"/>
+    <w:uiPriority w:val="9"/>
+    <w:semiHidden/>
+    <w:unhideWhenUsed/>
+    <w:qFormat/>
+    <w:rsid w:val="00CB055B"/>
+    <w:pPr>
+      <w:keepNext/>
+      <w:keepLines/>
+      <w:spacing w:line="278" w:lineRule="auto"/>
+      <w:outlineLvl w:val="7"/>
+    </w:pPr>
+    <w:rPr>
+      <w:rFonts w:asciiTheme="minorHAnsi" w:eastAsiaTheme="majorEastAsia" w:hAnsiTheme="minorHAnsi" w:cstheme="majorBidi"/>
+      <w:i/>
+      <w:iCs/>
+      <w:color w:val="272727" w:themeColor="text1" w:themeTint="D8"/>
+      <w:kern w:val="2"/>
+      <w:sz w:val="24"/>
+      <w:szCs w:val="24"/>
+      <w:lang w:val="en-US"/>
+      <w14:ligatures w14:val="standardContextual"/>
+    </w:rPr>
+  </w:style>
+  <w:style w:type="paragraph" w:styleId="Heading9">
+    <w:name w:val="heading 9"/>
+    <w:basedOn w:val="Normal"/>
+    <w:next w:val="Normal"/>
+    <w:link w:val="Heading9Char"/>
+    <w:uiPriority w:val="9"/>
+    <w:semiHidden/>
+    <w:unhideWhenUsed/>
+    <w:qFormat/>
+    <w:rsid w:val="00CB055B"/>
+    <w:pPr>
+      <w:keepNext/>
+      <w:keepLines/>
+      <w:spacing w:line="278" w:lineRule="auto"/>
+      <w:outlineLvl w:val="8"/>
+    </w:pPr>
+    <w:rPr>
+      <w:rFonts w:asciiTheme="minorHAnsi" w:eastAsiaTheme="majorEastAsia" w:hAnsiTheme="minorHAnsi" w:cstheme="majorBidi"/>
+      <w:color w:val="272727" w:themeColor="text1" w:themeTint="D8"/>
+      <w:kern w:val="2"/>
+      <w:sz w:val="24"/>
+      <w:szCs w:val="24"/>
+      <w:lang w:val="en-US"/>
+      <w14:ligatures w14:val="standardContextual"/>
     </w:rPr>
   </w:style>
   <w:style w:type="character" w:default="1" w:styleId="DefaultParagraphFont">
@@ -1394,56 +1505,322 @@
     <w:semiHidden/>
     <w:unhideWhenUsed/>
   </w:style>
-  <w:style w:type="table" w:customStyle="1" w:styleId="TableNormal0">
-    <w:name w:val="TableNormal"/>
-    <w:tblPr>
-      <w:tblCellMar>
-        <w:top w:w="100" w:type="dxa"/>
-        <w:left w:w="100" w:type="dxa"/>
-        <w:bottom w:w="100" w:type="dxa"/>
-        <w:right w:w="100" w:type="dxa"/>
-      </w:tblCellMar>
-    </w:tblPr>
+  <w:style w:type="character" w:customStyle="1" w:styleId="Heading1Char">
+    <w:name w:val="Heading 1 Char"/>
+    <w:basedOn w:val="DefaultParagraphFont"/>
+    <w:link w:val="Heading1"/>
+    <w:uiPriority w:val="9"/>
+    <w:rsid w:val="00CB055B"/>
+    <w:rPr>
+      <w:rFonts w:asciiTheme="majorHAnsi" w:eastAsiaTheme="majorEastAsia" w:hAnsiTheme="majorHAnsi" w:cstheme="majorBidi"/>
+      <w:color w:val="2F5496" w:themeColor="accent1" w:themeShade="BF"/>
+      <w:sz w:val="40"/>
+      <w:szCs w:val="40"/>
+    </w:rPr>
+  </w:style>
+  <w:style w:type="character" w:customStyle="1" w:styleId="Heading2Char">
+    <w:name w:val="Heading 2 Char"/>
+    <w:basedOn w:val="DefaultParagraphFont"/>
+    <w:link w:val="Heading2"/>
+    <w:uiPriority w:val="9"/>
+    <w:semiHidden/>
+    <w:rsid w:val="00CB055B"/>
+    <w:rPr>
+      <w:rFonts w:asciiTheme="majorHAnsi" w:eastAsiaTheme="majorEastAsia" w:hAnsiTheme="majorHAnsi" w:cstheme="majorBidi"/>
+      <w:color w:val="2F5496" w:themeColor="accent1" w:themeShade="BF"/>
+      <w:sz w:val="32"/>
+      <w:szCs w:val="32"/>
+    </w:rPr>
+  </w:style>
+  <w:style w:type="character" w:customStyle="1" w:styleId="Heading3Char">
+    <w:name w:val="Heading 3 Char"/>
+    <w:basedOn w:val="DefaultParagraphFont"/>
+    <w:link w:val="Heading3"/>
+    <w:uiPriority w:val="9"/>
+    <w:semiHidden/>
+    <w:rsid w:val="00CB055B"/>
+    <w:rPr>
+      <w:rFonts w:eastAsiaTheme="majorEastAsia" w:cstheme="majorBidi"/>
+      <w:color w:val="2F5496" w:themeColor="accent1" w:themeShade="BF"/>
+      <w:sz w:val="28"/>
+      <w:szCs w:val="28"/>
+    </w:rPr>
+  </w:style>
+  <w:style w:type="character" w:customStyle="1" w:styleId="Heading4Char">
+    <w:name w:val="Heading 4 Char"/>
+    <w:basedOn w:val="DefaultParagraphFont"/>
+    <w:link w:val="Heading4"/>
+    <w:uiPriority w:val="9"/>
+    <w:semiHidden/>
+    <w:rsid w:val="00CB055B"/>
+    <w:rPr>
+      <w:rFonts w:eastAsiaTheme="majorEastAsia" w:cstheme="majorBidi"/>
+      <w:i/>
+      <w:iCs/>
+      <w:color w:val="2F5496" w:themeColor="accent1" w:themeShade="BF"/>
+    </w:rPr>
+  </w:style>
+  <w:style w:type="character" w:customStyle="1" w:styleId="Heading5Char">
+    <w:name w:val="Heading 5 Char"/>
+    <w:basedOn w:val="DefaultParagraphFont"/>
+    <w:link w:val="Heading5"/>
+    <w:uiPriority w:val="9"/>
+    <w:semiHidden/>
+    <w:rsid w:val="00CB055B"/>
+    <w:rPr>
+      <w:rFonts w:eastAsiaTheme="majorEastAsia" w:cstheme="majorBidi"/>
+      <w:color w:val="2F5496" w:themeColor="accent1" w:themeShade="BF"/>
+    </w:rPr>
+  </w:style>
+  <w:style w:type="character" w:customStyle="1" w:styleId="Heading6Char">
+    <w:name w:val="Heading 6 Char"/>
+    <w:basedOn w:val="DefaultParagraphFont"/>
+    <w:link w:val="Heading6"/>
+    <w:uiPriority w:val="9"/>
+    <w:semiHidden/>
+    <w:rsid w:val="00CB055B"/>
+    <w:rPr>
+      <w:rFonts w:eastAsiaTheme="majorEastAsia" w:cstheme="majorBidi"/>
+      <w:i/>
+      <w:iCs/>
+      <w:color w:val="595959" w:themeColor="text1" w:themeTint="A6"/>
+    </w:rPr>
+  </w:style>
+  <w:style w:type="character" w:customStyle="1" w:styleId="Heading7Char">
+    <w:name w:val="Heading 7 Char"/>
+    <w:basedOn w:val="DefaultParagraphFont"/>
+    <w:link w:val="Heading7"/>
+    <w:uiPriority w:val="9"/>
+    <w:semiHidden/>
+    <w:rsid w:val="00CB055B"/>
+    <w:rPr>
+      <w:rFonts w:eastAsiaTheme="majorEastAsia" w:cstheme="majorBidi"/>
+      <w:color w:val="595959" w:themeColor="text1" w:themeTint="A6"/>
+    </w:rPr>
+  </w:style>
+  <w:style w:type="character" w:customStyle="1" w:styleId="Heading8Char">
+    <w:name w:val="Heading 8 Char"/>
+    <w:basedOn w:val="DefaultParagraphFont"/>
+    <w:link w:val="Heading8"/>
+    <w:uiPriority w:val="9"/>
+    <w:semiHidden/>
+    <w:rsid w:val="00CB055B"/>
+    <w:rPr>
+      <w:rFonts w:eastAsiaTheme="majorEastAsia" w:cstheme="majorBidi"/>
+      <w:i/>
+      <w:iCs/>
+      <w:color w:val="272727" w:themeColor="text1" w:themeTint="D8"/>
+    </w:rPr>
+  </w:style>
+  <w:style w:type="character" w:customStyle="1" w:styleId="Heading9Char">
+    <w:name w:val="Heading 9 Char"/>
+    <w:basedOn w:val="DefaultParagraphFont"/>
+    <w:link w:val="Heading9"/>
+    <w:uiPriority w:val="9"/>
+    <w:semiHidden/>
+    <w:rsid w:val="00CB055B"/>
+    <w:rPr>
+      <w:rFonts w:eastAsiaTheme="majorEastAsia" w:cstheme="majorBidi"/>
+      <w:color w:val="272727" w:themeColor="text1" w:themeTint="D8"/>
+    </w:rPr>
   </w:style>
   <w:style w:type="paragraph" w:styleId="Title">
     <w:name w:val="Title"/>
     <w:basedOn w:val="Normal"/>
     <w:next w:val="Normal"/>
+    <w:link w:val="TitleChar"/>
     <w:uiPriority w:val="10"/>
     <w:qFormat/>
+    <w:rsid w:val="00CB055B"/>
     <w:pPr>
-      <w:keepNext/>
-      <w:keepLines/>
-      <w:spacing w:after="60"/>
+      <w:spacing w:after="80" w:line="240" w:lineRule="auto"/>
+      <w:contextualSpacing/>
     </w:pPr>
     <w:rPr>
-      <w:sz w:val="52"/>
-      <w:szCs w:val="52"/>
+      <w:rFonts w:asciiTheme="majorHAnsi" w:eastAsiaTheme="majorEastAsia" w:hAnsiTheme="majorHAnsi" w:cstheme="majorBidi"/>
+      <w:spacing w:val="-10"/>
+      <w:kern w:val="28"/>
+      <w:sz w:val="56"/>
+      <w:szCs w:val="56"/>
+      <w:lang w:val="en-US"/>
+      <w14:ligatures w14:val="standardContextual"/>
+    </w:rPr>
+  </w:style>
+  <w:style w:type="character" w:customStyle="1" w:styleId="TitleChar">
+    <w:name w:val="Title Char"/>
+    <w:basedOn w:val="DefaultParagraphFont"/>
+    <w:link w:val="Title"/>
+    <w:uiPriority w:val="10"/>
+    <w:rsid w:val="00CB055B"/>
+    <w:rPr>
+      <w:rFonts w:asciiTheme="majorHAnsi" w:eastAsiaTheme="majorEastAsia" w:hAnsiTheme="majorHAnsi" w:cstheme="majorBidi"/>
+      <w:spacing w:val="-10"/>
+      <w:kern w:val="28"/>
+      <w:sz w:val="56"/>
+      <w:szCs w:val="56"/>
     </w:rPr>
   </w:style>
   <w:style w:type="paragraph" w:styleId="Subtitle">
     <w:name w:val="Subtitle"/>
     <w:basedOn w:val="Normal"/>
     <w:next w:val="Normal"/>
+    <w:link w:val="SubtitleChar"/>
     <w:uiPriority w:val="11"/>
     <w:qFormat/>
+    <w:rsid w:val="00CB055B"/>
     <w:pPr>
-      <w:keepNext/>
-      <w:keepLines/>
-      <w:spacing w:after="320"/>
+      <w:numPr>
+        <w:ilvl w:val="1"/>
+      </w:numPr>
+      <w:spacing w:after="160" w:line="278" w:lineRule="auto"/>
     </w:pPr>
     <w:rPr>
-      <w:color w:val="666666"/>
-      <w:sz w:val="30"/>
-      <w:szCs w:val="30"/>
-    </w:rPr>
-  </w:style>
-  <w:style w:type="table" w:customStyle="1" w:styleId="a">
-    <w:basedOn w:val="TableNormal0"/>
-    <w:tblPr>
-      <w:tblStyleRowBandSize w:val="1"/>
-      <w:tblStyleColBandSize w:val="1"/>
-    </w:tblPr>
+      <w:rFonts w:asciiTheme="minorHAnsi" w:eastAsiaTheme="majorEastAsia" w:hAnsiTheme="minorHAnsi" w:cstheme="majorBidi"/>
+      <w:color w:val="595959" w:themeColor="text1" w:themeTint="A6"/>
+      <w:spacing w:val="15"/>
+      <w:kern w:val="2"/>
+      <w:sz w:val="28"/>
+      <w:szCs w:val="28"/>
+      <w:lang w:val="en-US"/>
+      <w14:ligatures w14:val="standardContextual"/>
+    </w:rPr>
+  </w:style>
+  <w:style w:type="character" w:customStyle="1" w:styleId="SubtitleChar">
+    <w:name w:val="Subtitle Char"/>
+    <w:basedOn w:val="DefaultParagraphFont"/>
+    <w:link w:val="Subtitle"/>
+    <w:uiPriority w:val="11"/>
+    <w:rsid w:val="00CB055B"/>
+    <w:rPr>
+      <w:rFonts w:eastAsiaTheme="majorEastAsia" w:cstheme="majorBidi"/>
+      <w:color w:val="595959" w:themeColor="text1" w:themeTint="A6"/>
+      <w:spacing w:val="15"/>
+      <w:sz w:val="28"/>
+      <w:szCs w:val="28"/>
+    </w:rPr>
+  </w:style>
+  <w:style w:type="paragraph" w:styleId="Quote">
+    <w:name w:val="Quote"/>
+    <w:basedOn w:val="Normal"/>
+    <w:next w:val="Normal"/>
+    <w:link w:val="QuoteChar"/>
+    <w:uiPriority w:val="29"/>
+    <w:qFormat/>
+    <w:rsid w:val="00CB055B"/>
+    <w:pPr>
+      <w:spacing w:before="160" w:after="160" w:line="278" w:lineRule="auto"/>
+      <w:jc w:val="center"/>
+    </w:pPr>
+    <w:rPr>
+      <w:rFonts w:asciiTheme="minorHAnsi" w:eastAsiaTheme="minorHAnsi" w:hAnsiTheme="minorHAnsi" w:cstheme="minorBidi"/>
+      <w:i/>
+      <w:iCs/>
+      <w:color w:val="404040" w:themeColor="text1" w:themeTint="BF"/>
+      <w:kern w:val="2"/>
+      <w:sz w:val="24"/>
+      <w:szCs w:val="24"/>
+      <w:lang w:val="en-US"/>
+      <w14:ligatures w14:val="standardContextual"/>
+    </w:rPr>
+  </w:style>
+  <w:style w:type="character" w:customStyle="1" w:styleId="QuoteChar">
+    <w:name w:val="Quote Char"/>
+    <w:basedOn w:val="DefaultParagraphFont"/>
+    <w:link w:val="Quote"/>
+    <w:uiPriority w:val="29"/>
+    <w:rsid w:val="00CB055B"/>
+    <w:rPr>
+      <w:i/>
+      <w:iCs/>
+      <w:color w:val="404040" w:themeColor="text1" w:themeTint="BF"/>
+    </w:rPr>
+  </w:style>
+  <w:style w:type="paragraph" w:styleId="ListParagraph">
+    <w:name w:val="List Paragraph"/>
+    <w:basedOn w:val="Normal"/>
+    <w:uiPriority w:val="34"/>
+    <w:qFormat/>
+    <w:rsid w:val="00CB055B"/>
+    <w:pPr>
+      <w:spacing w:after="160" w:line="278" w:lineRule="auto"/>
+      <w:ind w:left="720"/>
+      <w:contextualSpacing/>
+    </w:pPr>
+    <w:rPr>
+      <w:rFonts w:asciiTheme="minorHAnsi" w:eastAsiaTheme="minorHAnsi" w:hAnsiTheme="minorHAnsi" w:cstheme="minorBidi"/>
+      <w:kern w:val="2"/>
+      <w:sz w:val="24"/>
+      <w:szCs w:val="24"/>
+      <w:lang w:val="en-US"/>
+      <w14:ligatures w14:val="standardContextual"/>
+    </w:rPr>
+  </w:style>
+  <w:style w:type="character" w:styleId="IntenseEmphasis">
+    <w:name w:val="Intense Emphasis"/>
+    <w:basedOn w:val="DefaultParagraphFont"/>
+    <w:uiPriority w:val="21"/>
+    <w:qFormat/>
+    <w:rsid w:val="00CB055B"/>
+    <w:rPr>
+      <w:i/>
+      <w:iCs/>
+      <w:color w:val="2F5496" w:themeColor="accent1" w:themeShade="BF"/>
+    </w:rPr>
+  </w:style>
+  <w:style w:type="paragraph" w:styleId="IntenseQuote">
+    <w:name w:val="Intense Quote"/>
+    <w:basedOn w:val="Normal"/>
+    <w:next w:val="Normal"/>
+    <w:link w:val="IntenseQuoteChar"/>
+    <w:uiPriority w:val="30"/>
+    <w:qFormat/>
+    <w:rsid w:val="00CB055B"/>
+    <w:pPr>
+      <w:pBdr>
+        <w:top w:val="single" w:sz="4" w:space="10" w:color="2F5496" w:themeColor="accent1" w:themeShade="BF"/>
+        <w:bottom w:val="single" w:sz="4" w:space="10" w:color="2F5496" w:themeColor="accent1" w:themeShade="BF"/>
+      </w:pBdr>
+      <w:spacing w:before="360" w:after="360" w:line="278" w:lineRule="auto"/>
+      <w:ind w:left="864" w:right="864"/>
+      <w:jc w:val="center"/>
+    </w:pPr>
+    <w:rPr>
+      <w:rFonts w:asciiTheme="minorHAnsi" w:eastAsiaTheme="minorHAnsi" w:hAnsiTheme="minorHAnsi" w:cstheme="minorBidi"/>
+      <w:i/>
+      <w:iCs/>
+      <w:color w:val="2F5496" w:themeColor="accent1" w:themeShade="BF"/>
+      <w:kern w:val="2"/>
+      <w:sz w:val="24"/>
+      <w:szCs w:val="24"/>
+      <w:lang w:val="en-US"/>
+      <w14:ligatures w14:val="standardContextual"/>
+    </w:rPr>
+  </w:style>
+  <w:style w:type="character" w:customStyle="1" w:styleId="IntenseQuoteChar">
+    <w:name w:val="Intense Quote Char"/>
+    <w:basedOn w:val="DefaultParagraphFont"/>
+    <w:link w:val="IntenseQuote"/>
+    <w:uiPriority w:val="30"/>
+    <w:rsid w:val="00CB055B"/>
+    <w:rPr>
+      <w:i/>
+      <w:iCs/>
+      <w:color w:val="2F5496" w:themeColor="accent1" w:themeShade="BF"/>
+    </w:rPr>
+  </w:style>
+  <w:style w:type="character" w:styleId="IntenseReference">
+    <w:name w:val="Intense Reference"/>
+    <w:basedOn w:val="DefaultParagraphFont"/>
+    <w:uiPriority w:val="32"/>
+    <w:qFormat/>
+    <w:rsid w:val="00CB055B"/>
+    <w:rPr>
+      <w:b/>
+      <w:bCs/>
+      <w:smallCaps/>
+      <w:color w:val="2F5496" w:themeColor="accent1" w:themeShade="BF"/>
+      <w:spacing w:val="5"/>
+    </w:rPr>
   </w:style>
 </w:styles>
 </file>
@@ -1459,44 +1836,44 @@
         <a:sysClr val="window" lastClr="FFFFFF"/>
       </a:lt1>
       <a:dk2>
-        <a:srgbClr val="1F497D"/>
+        <a:srgbClr val="44546A"/>
       </a:dk2>
       <a:lt2>
-        <a:srgbClr val="EEECE1"/>
+        <a:srgbClr val="E7E6E6"/>
       </a:lt2>
       <a:accent1>
-        <a:srgbClr val="4F81BD"/>
+        <a:srgbClr val="4472C4"/>
       </a:accent1>
       <a:accent2>
-        <a:srgbClr val="C0504D"/>
+        <a:srgbClr val="ED7D31"/>
       </a:accent2>
       <a:accent3>
-        <a:srgbClr val="9BBB59"/>
+        <a:srgbClr val="A5A5A5"/>
       </a:accent3>
       <a:accent4>
-        <a:srgbClr val="8064A2"/>
+        <a:srgbClr val="FFC000"/>
       </a:accent4>
       <a:accent5>
-        <a:srgbClr val="4BACC6"/>
+        <a:srgbClr val="5B9BD5"/>
       </a:accent5>
       <a:accent6>
-        <a:srgbClr val="F79646"/>
+        <a:srgbClr val="70AD47"/>
       </a:accent6>
       <a:hlink>
-        <a:srgbClr val="0000FF"/>
+        <a:srgbClr val="0563C1"/>
       </a:hlink>
       <a:folHlink>
-        <a:srgbClr val="800080"/>
+        <a:srgbClr val="954F72"/>
       </a:folHlink>
     </a:clrScheme>
     <a:fontScheme name="Office">
       <a:majorFont>
-        <a:latin typeface="Calibri"/>
+        <a:latin typeface="Calibri Light" panose="020F0302020204030204"/>
         <a:ea typeface=""/>
         <a:cs typeface=""/>
-        <a:font script="Jpan" typeface="ＭＳ ゴシック"/>
+        <a:font script="Jpan" typeface="游ゴシック Light"/>
         <a:font script="Hang" typeface="맑은 고딕"/>
-        <a:font script="Hans" typeface="宋体"/>
+        <a:font script="Hans" typeface="等线 Light"/>
         <a:font script="Hant" typeface="新細明體"/>
         <a:font script="Arab" typeface="Times New Roman"/>
         <a:font script="Hebr" typeface="Times New Roman"/>
@@ -1524,14 +1901,31 @@
         <a:font script="Viet" typeface="Times New Roman"/>
         <a:font script="Uigh" typeface="Microsoft Uighur"/>
         <a:font script="Geor" typeface="Sylfaen"/>
+        <a:font script="Armn" typeface="Arial"/>
+        <a:font script="Bugi" typeface="Leelawadee UI"/>
+        <a:font script="Bopo" typeface="Microsoft JhengHei"/>
+        <a:font script="Java" typeface="Javanese Text"/>
+        <a:font script="Lisu" typeface="Segoe UI"/>
+        <a:font script="Mymr" typeface="Myanmar Text"/>
+        <a:font script="Nkoo" typeface="Ebrima"/>
+        <a:font script="Olck" typeface="Nirmala UI"/>
+        <a:font script="Osma" typeface="Ebrima"/>
+        <a:font script="Phag" typeface="Phagspa"/>
+        <a:font script="Syrn" typeface="Estrangelo Edessa"/>
+        <a:font script="Syrj" typeface="Estrangelo Edessa"/>
+        <a:font script="Syre" typeface="Estrangelo Edessa"/>
+        <a:font script="Sora" typeface="Nirmala UI"/>
+        <a:font script="Tale" typeface="Microsoft Tai Le"/>
+        <a:font script="Talu" typeface="Microsoft New Tai Lue"/>
+        <a:font script="Tfng" typeface="Ebrima"/>
       </a:majorFont>
       <a:minorFont>
-        <a:latin typeface="Cambria"/>
+        <a:latin typeface="Calibri" panose="020F0502020204030204"/>
         <a:ea typeface=""/>
         <a:cs typeface=""/>
-        <a:font script="Jpan" typeface="ＭＳ 明朝"/>
+        <a:font script="Jpan" typeface="游ゴシック"/>
         <a:font script="Hang" typeface="맑은 고딕"/>
-        <a:font script="Hans" typeface="宋体"/>
+        <a:font script="Hans" typeface="等线"/>
         <a:font script="Hant" typeface="新細明體"/>
         <a:font script="Arab" typeface="Arial"/>
         <a:font script="Hebr" typeface="Arial"/>
@@ -1559,6 +1953,23 @@
         <a:font script="Viet" typeface="Arial"/>
         <a:font script="Uigh" typeface="Microsoft Uighur"/>
         <a:font script="Geor" typeface="Sylfaen"/>
+        <a:font script="Armn" typeface="Arial"/>
+        <a:font script="Bugi" typeface="Leelawadee UI"/>
+        <a:font script="Bopo" typeface="Microsoft JhengHei"/>
+        <a:font script="Java" typeface="Javanese Text"/>
+        <a:font script="Lisu" typeface="Segoe UI"/>
+        <a:font script="Mymr" typeface="Myanmar Text"/>
+        <a:font script="Nkoo" typeface="Ebrima"/>
+        <a:font script="Olck" typeface="Nirmala UI"/>
+        <a:font script="Osma" typeface="Ebrima"/>
+        <a:font script="Phag" typeface="Phagspa"/>
+        <a:font script="Syrn" typeface="Estrangelo Edessa"/>
+        <a:font script="Syrj" typeface="Estrangelo Edessa"/>
+        <a:font script="Syre" typeface="Estrangelo Edessa"/>
+        <a:font script="Sora" typeface="Nirmala UI"/>
+        <a:font script="Tale" typeface="Microsoft Tai Le"/>
+        <a:font script="Talu" typeface="Microsoft New Tai Lue"/>
+        <a:font script="Tfng" typeface="Ebrima"/>
       </a:minorFont>
     </a:fontScheme>
     <a:fmtScheme name="Office">
@@ -1570,200 +1981,141 @@
           <a:gsLst>
             <a:gs pos="0">
               <a:schemeClr val="phClr">
-                <a:tint val="50000"/>
-                <a:satMod val="300000"/>
+                <a:lumMod val="110000"/>
+                <a:satMod val="105000"/>
+                <a:tint val="67000"/>
               </a:schemeClr>
             </a:gs>
-            <a:gs pos="35000">
+            <a:gs pos="50000">
               <a:schemeClr val="phClr">
-                <a:tint val="37000"/>
-                <a:satMod val="300000"/>
+                <a:lumMod val="105000"/>
+                <a:satMod val="103000"/>
+                <a:tint val="73000"/>
               </a:schemeClr>
             </a:gs>
             <a:gs pos="100000">
               <a:schemeClr val="phClr">
-                <a:tint val="15000"/>
-                <a:satMod val="350000"/>
+                <a:lumMod val="105000"/>
+                <a:satMod val="109000"/>
+                <a:tint val="81000"/>
               </a:schemeClr>
             </a:gs>
           </a:gsLst>
-          <a:lin ang="16200000" scaled="1"/>
+          <a:lin ang="5400000" scaled="0"/>
         </a:gradFill>
         <a:gradFill rotWithShape="1">
           <a:gsLst>
             <a:gs pos="0">
               <a:schemeClr val="phClr">
-                <a:tint val="100000"/>
+                <a:satMod val="103000"/>
+                <a:lumMod val="102000"/>
+                <a:tint val="94000"/>
+              </a:schemeClr>
+            </a:gs>
+            <a:gs pos="50000">
+              <a:schemeClr val="phClr">
+                <a:satMod val="110000"/>
+                <a:lumMod val="100000"/>
                 <a:shade val="100000"/>
-                <a:satMod val="130000"/>
               </a:schemeClr>
             </a:gs>
             <a:gs pos="100000">
               <a:schemeClr val="phClr">
-                <a:tint val="50000"/>
-                <a:shade val="100000"/>
-                <a:satMod val="350000"/>
+                <a:lumMod val="99000"/>
+                <a:satMod val="120000"/>
+                <a:shade val="78000"/>
               </a:schemeClr>
             </a:gs>
           </a:gsLst>
-          <a:lin ang="16200000" scaled="0"/>
+          <a:lin ang="5400000" scaled="0"/>
         </a:gradFill>
       </a:fillStyleLst>
       <a:lnStyleLst>
-        <a:ln w="9525" cap="flat" cmpd="sng" algn="ctr">
-          <a:solidFill>
-            <a:schemeClr val="phClr">
-              <a:shade val="95000"/>
-              <a:satMod val="105000"/>
-            </a:schemeClr>
-          </a:solidFill>
-          <a:prstDash val="solid"/>
-        </a:ln>
-        <a:ln w="25400" cap="flat" cmpd="sng" algn="ctr">
+        <a:ln w="6350" cap="flat" cmpd="sng" algn="ctr">
           <a:solidFill>
             <a:schemeClr val="phClr"/>
           </a:solidFill>
           <a:prstDash val="solid"/>
+          <a:miter lim="800000"/>
         </a:ln>
-        <a:ln w="38100" cap="flat" cmpd="sng" algn="ctr">
+        <a:ln w="12700" cap="flat" cmpd="sng" algn="ctr">
           <a:solidFill>
             <a:schemeClr val="phClr"/>
           </a:solidFill>
           <a:prstDash val="solid"/>
+          <a:miter lim="800000"/>
+        </a:ln>
+        <a:ln w="19050" cap="flat" cmpd="sng" algn="ctr">
+          <a:solidFill>
+            <a:schemeClr val="phClr"/>
+          </a:solidFill>
+          <a:prstDash val="solid"/>
+          <a:miter lim="800000"/>
         </a:ln>
       </a:lnStyleLst>
       <a:effectStyleLst>
         <a:effectStyle>
+          <a:effectLst/>
+        </a:effectStyle>
+        <a:effectStyle>
+          <a:effectLst/>
+        </a:effectStyle>
+        <a:effectStyle>
           <a:effectLst>
-            <a:outerShdw blurRad="40000" dist="20000" dir="5400000" rotWithShape="0">
+            <a:outerShdw blurRad="57150" dist="19050" dir="5400000" algn="ctr" rotWithShape="0">
               <a:srgbClr val="000000">
-                <a:alpha val="38000"/>
+                <a:alpha val="63000"/>
               </a:srgbClr>
             </a:outerShdw>
           </a:effectLst>
-        </a:effectStyle>
-        <a:effectStyle>
-          <a:effectLst>
-            <a:outerShdw blurRad="40000" dist="23000" dir="5400000" rotWithShape="0">
-              <a:srgbClr val="000000">
-                <a:alpha val="35000"/>
-              </a:srgbClr>
-            </a:outerShdw>
-          </a:effectLst>
-        </a:effectStyle>
-        <a:effectStyle>
-          <a:effectLst>
-            <a:outerShdw blurRad="40000" dist="23000" dir="5400000" rotWithShape="0">
-              <a:srgbClr val="000000">
-                <a:alpha val="35000"/>
-              </a:srgbClr>
-            </a:outerShdw>
-          </a:effectLst>
-          <a:scene3d>
-            <a:camera prst="orthographicFront">
-              <a:rot lat="0" lon="0" rev="0"/>
-            </a:camera>
-            <a:lightRig rig="threePt" dir="t">
-              <a:rot lat="0" lon="0" rev="1200000"/>
-            </a:lightRig>
-          </a:scene3d>
-          <a:sp3d>
-            <a:bevelT w="63500" h="25400"/>
-          </a:sp3d>
         </a:effectStyle>
       </a:effectStyleLst>
       <a:bgFillStyleLst>
         <a:solidFill>
           <a:schemeClr val="phClr"/>
         </a:solidFill>
+        <a:solidFill>
+          <a:schemeClr val="phClr">
+            <a:tint val="95000"/>
+            <a:satMod val="170000"/>
+          </a:schemeClr>
+        </a:solidFill>
         <a:gradFill rotWithShape="1">
           <a:gsLst>
             <a:gs pos="0">
               <a:schemeClr val="phClr">
-                <a:tint val="40000"/>
-                <a:satMod val="350000"/>
+                <a:tint val="93000"/>
+                <a:satMod val="150000"/>
+                <a:shade val="98000"/>
+                <a:lumMod val="102000"/>
               </a:schemeClr>
             </a:gs>
-            <a:gs pos="40000">
+            <a:gs pos="50000">
               <a:schemeClr val="phClr">
-                <a:tint val="45000"/>
-                <a:shade val="99000"/>
-                <a:satMod val="350000"/>
+                <a:tint val="98000"/>
+                <a:satMod val="130000"/>
+                <a:shade val="90000"/>
+                <a:lumMod val="103000"/>
               </a:schemeClr>
             </a:gs>
             <a:gs pos="100000">
               <a:schemeClr val="phClr">
-                <a:shade val="20000"/>
-                <a:satMod val="255000"/>
+                <a:shade val="63000"/>
+                <a:satMod val="120000"/>
               </a:schemeClr>
             </a:gs>
           </a:gsLst>
-          <a:path path="circle">
-            <a:fillToRect l="50000" t="-80000" r="50000" b="180000"/>
-          </a:path>
-        </a:gradFill>
-        <a:gradFill rotWithShape="1">
-          <a:gsLst>
-            <a:gs pos="0">
-              <a:schemeClr val="phClr">
-                <a:tint val="80000"/>
-                <a:satMod val="300000"/>
-              </a:schemeClr>
-            </a:gs>
-            <a:gs pos="100000">
-              <a:schemeClr val="phClr">
-                <a:shade val="30000"/>
-                <a:satMod val="200000"/>
-              </a:schemeClr>
-            </a:gs>
-          </a:gsLst>
-          <a:path path="circle">
-            <a:fillToRect l="50000" t="50000" r="50000" b="50000"/>
-          </a:path>
+          <a:lin ang="5400000" scaled="0"/>
         </a:gradFill>
       </a:bgFillStyleLst>
     </a:fmtScheme>
   </a:themeElements>
-  <a:objectDefaults>
-    <a:spDef>
-      <a:spPr/>
-      <a:bodyPr/>
-      <a:lstStyle/>
-      <a:style>
-        <a:lnRef idx="1">
-          <a:schemeClr val="accent1"/>
-        </a:lnRef>
-        <a:fillRef idx="3">
-          <a:schemeClr val="accent1"/>
-        </a:fillRef>
-        <a:effectRef idx="2">
-          <a:schemeClr val="accent1"/>
-        </a:effectRef>
-        <a:fontRef idx="minor">
-          <a:schemeClr val="lt1"/>
-        </a:fontRef>
-      </a:style>
-    </a:spDef>
-    <a:lnDef>
-      <a:spPr/>
-      <a:bodyPr/>
-      <a:lstStyle/>
-      <a:style>
-        <a:lnRef idx="2">
-          <a:schemeClr val="accent1"/>
-        </a:lnRef>
-        <a:fillRef idx="0">
-          <a:schemeClr val="accent1"/>
-        </a:fillRef>
-        <a:effectRef idx="1">
-          <a:schemeClr val="accent1"/>
-        </a:effectRef>
-        <a:fontRef idx="minor">
-          <a:schemeClr val="tx1"/>
-        </a:fontRef>
-      </a:style>
-    </a:lnDef>
-  </a:objectDefaults>
+  <a:objectDefaults/>
   <a:extraClrSchemeLst/>
+  <a:extLst>
+    <a:ext uri="{05A4C25C-085E-4340-85A3-A5531E510DB2}">
+      <thm15:themeFamily xmlns:thm15="http://schemas.microsoft.com/office/thememl/2012/main" name="Office Theme" id="{62F939B6-93AF-4DB8-9C6B-D6C7DFDC589F}" vid="{4A3C46E8-61CC-4603-A589-7422A47A8E4A}"/>
+    </a:ext>
+  </a:extLst>
 </a:theme>
 </file>
</xml_diff>